<commit_message>
update: June 9 agenda with 6 items from voice
</commit_message>
<xml_diff>
--- a/files/260609_KELLY_Weekly_Agenda.docx
+++ b/files/260609_KELLY_Weekly_Agenda.docx
@@ -8,21 +8,17 @@
         <w:keepNext w:val="0"/>
         <w:keepLines w:val="0"/>
         <w:spacing w:before="100" w:after="0" w:line="240" w:lineRule="auto"/>
-        <w:rPr>
-          <w:rFonts w:ascii="Arial" w:cs="Arial" w:hAnsi="Arial" w:eastAsia="Arial"/>
-          <w:sz w:val="28"/>
-          <w:szCs w:val="28"/>
-        </w:rPr>
       </w:pPr>
       <w:r>
         <w:rPr>
           <w:rFonts w:ascii="Arial" w:hAnsi="Arial"/>
-          <w:sz w:val="28"/>
-          <w:szCs w:val="28"/>
+          <w:sz w:val="36"/>
+          <w:szCs w:val="36"/>
+          <w:u w:val="single"/>
           <w:rtl w:val="0"/>
           <w:lang w:val="en-US"/>
         </w:rPr>
-        <w:t xml:space="preserve">KELLY RESIDENCE</w:t>
+        <w:t>KELLY RESIDENCE</w:t>
       </w:r>
     </w:p>
     <w:p>
@@ -31,11 +27,6 @@
         <w:keepNext w:val="0"/>
         <w:keepLines w:val="0"/>
         <w:spacing w:before="100" w:after="0" w:line="240" w:lineRule="auto"/>
-        <w:rPr>
-          <w:rFonts w:ascii="Arial" w:cs="Arial" w:hAnsi="Arial" w:eastAsia="Arial"/>
-          <w:sz w:val="24"/>
-          <w:szCs w:val="24"/>
-        </w:rPr>
       </w:pPr>
       <w:r>
         <w:rPr>
@@ -45,18 +36,13 @@
           <w:rtl w:val="0"/>
           <w:lang w:val="en-US"/>
         </w:rPr>
-        <w:t xml:space="preserve">Weekly Agenda</w:t>
+        <w:t>Weekly Agenda</w:t>
       </w:r>
     </w:p>
     <w:p>
       <w:pPr>
-        <w:pStyle w:val="Body"/>
+        <w:pStyle w:val="Body A"/>
         <w:spacing w:after="0" w:line="240" w:lineRule="auto"/>
-        <w:rPr>
-          <w:rFonts w:ascii="Arial" w:cs="Arial" w:hAnsi="Arial" w:eastAsia="Arial"/>
-          <w:sz w:val="20"/>
-          <w:szCs w:val="20"/>
-        </w:rPr>
       </w:pPr>
       <w:r>
         <w:rPr>
@@ -66,18 +52,13 @@
           <w:rtl w:val="0"/>
           <w:lang w:val="en-US"/>
         </w:rPr>
-        <w:t xml:space="preserve">Weekly Meeting</w:t>
+        <w:t xml:space="preserve">for the week of</w:t>
       </w:r>
     </w:p>
     <w:p>
       <w:pPr>
-        <w:pStyle w:val="Body"/>
-        <w:spacing w:after="160" w:line="240" w:lineRule="auto"/>
-        <w:rPr>
-          <w:rFonts w:ascii="Arial" w:cs="Arial" w:hAnsi="Arial" w:eastAsia="Arial"/>
-          <w:sz w:val="20"/>
-          <w:szCs w:val="20"/>
-        </w:rPr>
+        <w:pStyle w:val="Body A"/>
+        <w:spacing w:after="0" w:line="240" w:lineRule="auto"/>
       </w:pPr>
       <w:r>
         <w:rPr>
@@ -92,7 +73,7 @@
     </w:p>
     <w:p>
       <w:pPr>
-        <w:pStyle w:val="Body"/>
+        <w:pStyle w:val="Body A"/>
         <w:spacing w:line="240" w:lineRule="auto"/>
       </w:pPr>
       <w:r>
@@ -108,47 +89,31 @@
     </w:p>
     <w:p>
       <w:pPr>
-        <w:pStyle w:val="Body"/>
+        <w:pStyle w:val="Body A"/>
         <w:spacing w:after="0" w:line="240" w:lineRule="auto"/>
       </w:pPr>
     </w:p>
     <w:p>
       <w:pPr>
-        <w:pStyle w:val="Heading1"/>
-        <w:spacing w:before="160" w:after="0" w:line="276" w:lineRule="auto"/>
+        <w:pStyle w:val="Heading"/>
       </w:pPr>
       <w:r>
         <w:rPr>
-          <w:rFonts w:ascii="Arial" w:hAnsi="Arial"/>
-          <w:b/>
-          <w:bCs/>
-          <w:sz w:val="20"/>
-          <w:szCs w:val="20"/>
           <w:u w:val="single"/>
           <w:rtl w:val="0"/>
           <w:lang w:val="en-US"/>
         </w:rPr>
-        <w:t xml:space="preserve">DRC BOARD MEETING:</w:t>
+        <w:t>PDR / PRELIMINARY DESIGN REVIEW:</w:t>
       </w:r>
     </w:p>
     <w:p>
       <w:pPr>
-        <w:pStyle w:val="Body"/>
+        <w:pStyle w:val="Body A"/>
         <w:numPr>
           <w:ilvl w:val="0"/>
           <w:numId w:val="2"/>
         </w:numPr>
-        <w:bidi w:val="0"/>
         <w:spacing w:after="0" w:line="276" w:lineRule="auto"/>
-        <w:ind w:right="0"/>
-        <w:jc w:val="left"/>
-        <w:rPr>
-          <w:rFonts w:ascii="Arial" w:hAnsi="Arial"/>
-          <w:sz w:val="20"/>
-          <w:szCs w:val="20"/>
-          <w:rtl w:val="0"/>
-          <w:lang w:val="en-US"/>
-        </w:rPr>
       </w:pPr>
       <w:r>
         <w:rPr>
@@ -158,27 +123,17 @@
           <w:rtl w:val="0"/>
           <w:lang w:val="en-US"/>
         </w:rPr>
-        <w:t xml:space="preserve">PDR under review — June 9 board meeting, Schaffer’s Mill DRC</w:t>
+        <w:t xml:space="preserve">Under review — June 9 board meeting, Schaffer’s Mill DRC</w:t>
       </w:r>
     </w:p>
     <w:p>
       <w:pPr>
-        <w:pStyle w:val="Body"/>
+        <w:pStyle w:val="Body A"/>
         <w:numPr>
           <w:ilvl w:val="1"/>
           <w:numId w:val="2"/>
         </w:numPr>
-        <w:bidi w:val="0"/>
         <w:spacing w:after="0" w:line="276" w:lineRule="auto"/>
-        <w:ind w:right="0"/>
-        <w:jc w:val="left"/>
-        <w:rPr>
-          <w:rFonts w:ascii="Arial" w:hAnsi="Arial"/>
-          <w:sz w:val="20"/>
-          <w:szCs w:val="20"/>
-          <w:rtl w:val="0"/>
-          <w:lang w:val="en-US"/>
-        </w:rPr>
       </w:pPr>
       <w:r>
         <w:rPr>
@@ -193,41 +148,25 @@
     </w:p>
     <w:p>
       <w:pPr>
-        <w:pStyle w:val="Heading1"/>
-        <w:spacing w:before="160" w:after="0" w:line="276" w:lineRule="auto"/>
+        <w:pStyle w:val="Heading"/>
       </w:pPr>
       <w:r>
         <w:rPr>
-          <w:rFonts w:ascii="Arial" w:hAnsi="Arial"/>
-          <w:b/>
-          <w:bCs/>
-          <w:sz w:val="20"/>
-          <w:szCs w:val="20"/>
           <w:u w:val="single"/>
           <w:rtl w:val="0"/>
           <w:lang w:val="en-US"/>
         </w:rPr>
-        <w:t xml:space="preserve">STATE PERMIT PACKAGE (HCD/DAA):</w:t>
+        <w:t>STATE PERMIT PACKAGE (HCD/DAA):</w:t>
       </w:r>
     </w:p>
     <w:p>
       <w:pPr>
-        <w:pStyle w:val="Body"/>
+        <w:pStyle w:val="Body A"/>
         <w:numPr>
           <w:ilvl w:val="0"/>
           <w:numId w:val="2"/>
         </w:numPr>
-        <w:bidi w:val="0"/>
         <w:spacing w:after="0" w:line="276" w:lineRule="auto"/>
-        <w:ind w:right="0"/>
-        <w:jc w:val="left"/>
-        <w:rPr>
-          <w:rFonts w:ascii="Arial" w:hAnsi="Arial"/>
-          <w:sz w:val="20"/>
-          <w:szCs w:val="20"/>
-          <w:rtl w:val="0"/>
-          <w:lang w:val="en-US"/>
-        </w:rPr>
       </w:pPr>
       <w:r>
         <w:rPr>
@@ -237,27 +176,17 @@
           <w:rtl w:val="0"/>
           <w:lang w:val="en-US"/>
         </w:rPr>
-        <w:t xml:space="preserve">Target submittal June 26 — coordinate with Method Homes / John Bacon</w:t>
+        <w:t xml:space="preserve">Target submittal June 26 — coordinating with Method Homes / John Bacon</w:t>
       </w:r>
     </w:p>
     <w:p>
       <w:pPr>
-        <w:pStyle w:val="Body"/>
+        <w:pStyle w:val="Body A"/>
         <w:numPr>
           <w:ilvl w:val="1"/>
           <w:numId w:val="2"/>
         </w:numPr>
-        <w:bidi w:val="0"/>
         <w:spacing w:after="0" w:line="276" w:lineRule="auto"/>
-        <w:ind w:right="0"/>
-        <w:jc w:val="left"/>
-        <w:rPr>
-          <w:rFonts w:ascii="Arial" w:hAnsi="Arial"/>
-          <w:sz w:val="20"/>
-          <w:szCs w:val="20"/>
-          <w:rtl w:val="0"/>
-          <w:lang w:val="en-US"/>
-        </w:rPr>
       </w:pPr>
       <w:r>
         <w:rPr>
@@ -267,13 +196,30 @@
           <w:rtl w:val="0"/>
           <w:lang w:val="en-US"/>
         </w:rPr>
-        <w:t xml:space="preserve">50% set issued with ISE structural revisions + Mod 1 interior layout pending</w:t>
+        <w:t xml:space="preserve">50% set issued — all consultants in coordination for state and local permit</w:t>
       </w:r>
     </w:p>
     <w:p>
       <w:pPr>
-        <w:pStyle w:val="Heading1"/>
-        <w:spacing w:before="160" w:after="0" w:line="276" w:lineRule="auto"/>
+        <w:pStyle w:val="Heading"/>
+      </w:pPr>
+      <w:r>
+        <w:rPr>
+          <w:u w:val="single"/>
+          <w:rtl w:val="0"/>
+          <w:lang w:val="en-US"/>
+        </w:rPr>
+        <w:t>MOD 1 INTERIORS:</w:t>
+      </w:r>
+    </w:p>
+    <w:p>
+      <w:pPr>
+        <w:pStyle w:val="Body A"/>
+        <w:numPr>
+          <w:ilvl w:val="0"/>
+          <w:numId w:val="2"/>
+        </w:numPr>
+        <w:spacing w:after="0" w:line="276" w:lineRule="auto"/>
       </w:pPr>
       <w:r>
         <w:rPr>
@@ -282,31 +228,20 @@
           <w:bCs/>
           <w:sz w:val="20"/>
           <w:szCs w:val="20"/>
-          <w:u w:val="single"/>
           <w:rtl w:val="0"/>
           <w:lang w:val="en-US"/>
         </w:rPr>
-        <w:t xml:space="preserve">MOD 1 INTERIORS:</w:t>
+        <w:t xml:space="preserve">Coordinate Mod 1 interior layout to meet state permit deadline</w:t>
       </w:r>
     </w:p>
     <w:p>
       <w:pPr>
-        <w:pStyle w:val="Body"/>
+        <w:pStyle w:val="Body A"/>
         <w:numPr>
-          <w:ilvl w:val="0"/>
+          <w:ilvl w:val="1"/>
           <w:numId w:val="2"/>
         </w:numPr>
-        <w:bidi w:val="0"/>
         <w:spacing w:after="0" w:line="276" w:lineRule="auto"/>
-        <w:ind w:right="0"/>
-        <w:jc w:val="left"/>
-        <w:rPr>
-          <w:rFonts w:ascii="Arial" w:hAnsi="Arial"/>
-          <w:sz w:val="20"/>
-          <w:szCs w:val="20"/>
-          <w:rtl w:val="0"/>
-          <w:lang w:val="en-US"/>
-        </w:rPr>
       </w:pPr>
       <w:r>
         <w:rPr>
@@ -316,27 +251,30 @@
           <w:rtl w:val="0"/>
           <w:lang w:val="en-US"/>
         </w:rPr>
-        <w:t xml:space="preserve">Interior design review — Mod 1 refinements, materials, and finishes coordination</w:t>
+        <w:t xml:space="preserve">Mechanical room, master bath, laundry scope to be finalized</w:t>
       </w:r>
     </w:p>
     <w:p>
       <w:pPr>
-        <w:pStyle w:val="Body"/>
-        <w:numPr>
-          <w:ilvl w:val="1"/>
-          <w:numId w:val="2"/>
-        </w:numPr>
-        <w:bidi w:val="0"/>
-        <w:spacing w:after="0" w:line="276" w:lineRule="auto"/>
-        <w:ind w:right="0"/>
-        <w:jc w:val="left"/>
+        <w:pStyle w:val="Heading"/>
+      </w:pPr>
+      <w:r>
         <w:rPr>
-          <w:rFonts w:ascii="Arial" w:hAnsi="Arial"/>
-          <w:sz w:val="20"/>
-          <w:szCs w:val="20"/>
+          <w:u w:val="single"/>
           <w:rtl w:val="0"/>
           <w:lang w:val="en-US"/>
         </w:rPr>
+        <w:t>CONSULTANT DELIVERABLES:</w:t>
+      </w:r>
+    </w:p>
+    <w:p>
+      <w:pPr>
+        <w:pStyle w:val="Body A"/>
+        <w:numPr>
+          <w:ilvl w:val="0"/>
+          <w:numId w:val="2"/>
+        </w:numPr>
+        <w:spacing w:after="0" w:line="276" w:lineRule="auto"/>
       </w:pPr>
       <w:r>
         <w:rPr>
@@ -346,46 +284,17 @@
           <w:rtl w:val="0"/>
           <w:lang w:val="en-US"/>
         </w:rPr>
-        <w:t xml:space="preserve">Mai Thor to lead — vanity design, master bath layout, mechanical room target 120–150 SF</w:t>
+        <w:t xml:space="preserve">All deliverables expected mid to late June for state and local permit</w:t>
       </w:r>
     </w:p>
     <w:p>
       <w:pPr>
-        <w:pStyle w:val="Heading1"/>
-        <w:spacing w:before="160" w:after="0" w:line="276" w:lineRule="auto"/>
-      </w:pPr>
-      <w:r>
-        <w:rPr>
-          <w:rFonts w:ascii="Arial" w:hAnsi="Arial"/>
-          <w:b/>
-          <w:bCs/>
-          <w:sz w:val="20"/>
-          <w:szCs w:val="20"/>
-          <w:u w:val="single"/>
-          <w:rtl w:val="0"/>
-          <w:lang w:val="en-US"/>
-        </w:rPr>
-        <w:t xml:space="preserve">CONSULTANT DELIVERABLES:</w:t>
-      </w:r>
-    </w:p>
-    <w:p>
-      <w:pPr>
-        <w:pStyle w:val="Body"/>
+        <w:pStyle w:val="Body A"/>
         <w:numPr>
-          <w:ilvl w:val="0"/>
+          <w:ilvl w:val="1"/>
           <w:numId w:val="2"/>
         </w:numPr>
-        <w:bidi w:val="0"/>
         <w:spacing w:after="0" w:line="276" w:lineRule="auto"/>
-        <w:ind w:right="0"/>
-        <w:jc w:val="left"/>
-        <w:rPr>
-          <w:rFonts w:ascii="Arial" w:hAnsi="Arial"/>
-          <w:sz w:val="20"/>
-          <w:szCs w:val="20"/>
-          <w:rtl w:val="0"/>
-          <w:lang w:val="en-US"/>
-        </w:rPr>
       </w:pPr>
       <w:r>
         <w:rPr>
@@ -395,27 +304,30 @@
           <w:rtl w:val="0"/>
           <w:lang w:val="en-US"/>
         </w:rPr>
-        <w:t xml:space="preserve">All deliverables expected mid to late June</w:t>
+        <w:t xml:space="preserve">MEG: mech, plumbing, Title 24  ·  ISE: structural  ·  Triad Holmes: civil</w:t>
       </w:r>
     </w:p>
     <w:p>
       <w:pPr>
-        <w:pStyle w:val="Body"/>
-        <w:numPr>
-          <w:ilvl w:val="1"/>
-          <w:numId w:val="2"/>
-        </w:numPr>
-        <w:bidi w:val="0"/>
-        <w:spacing w:after="0" w:line="276" w:lineRule="auto"/>
-        <w:ind w:right="0"/>
-        <w:jc w:val="left"/>
+        <w:pStyle w:val="Heading"/>
+      </w:pPr>
+      <w:r>
         <w:rPr>
-          <w:rFonts w:ascii="Arial" w:hAnsi="Arial"/>
-          <w:sz w:val="20"/>
-          <w:szCs w:val="20"/>
+          <w:u w:val="single"/>
           <w:rtl w:val="0"/>
           <w:lang w:val="en-US"/>
         </w:rPr>
+        <w:t>LOCAL PERMIT — PLACER COUNTY:</w:t>
+      </w:r>
+    </w:p>
+    <w:p>
+      <w:pPr>
+        <w:pStyle w:val="Body A"/>
+        <w:numPr>
+          <w:ilvl w:val="0"/>
+          <w:numId w:val="2"/>
+        </w:numPr>
+        <w:spacing w:after="0" w:line="276" w:lineRule="auto"/>
       </w:pPr>
       <w:r>
         <w:rPr>
@@ -425,27 +337,17 @@
           <w:rtl w:val="0"/>
           <w:lang w:val="en-US"/>
         </w:rPr>
-        <w:t xml:space="preserve">MEG: Cummings (mech), Mathia (plumbing), Hafner (Title 24)</w:t>
+        <w:t xml:space="preserve">Target submittal July 12 — all digital plan check via permits.placer.ca.gov</w:t>
       </w:r>
     </w:p>
     <w:p>
       <w:pPr>
-        <w:pStyle w:val="Body"/>
+        <w:pStyle w:val="Body A"/>
         <w:numPr>
           <w:ilvl w:val="1"/>
           <w:numId w:val="2"/>
         </w:numPr>
-        <w:bidi w:val="0"/>
         <w:spacing w:after="0" w:line="276" w:lineRule="auto"/>
-        <w:ind w:right="0"/>
-        <w:jc w:val="left"/>
-        <w:rPr>
-          <w:rFonts w:ascii="Arial" w:hAnsi="Arial"/>
-          <w:sz w:val="20"/>
-          <w:szCs w:val="20"/>
-          <w:rtl w:val="0"/>
-          <w:lang w:val="en-US"/>
-        </w:rPr>
       </w:pPr>
       <w:r>
         <w:rPr>
@@ -455,46 +357,30 @@
           <w:rtl w:val="0"/>
           <w:lang w:val="en-US"/>
         </w:rPr>
-        <w:t xml:space="preserve">ISE: DeLeon / Lothrop (structural)  ·  Triad Holmes: Petroni (civil)  ·  WSFP: Soares (fire)</w:t>
+        <w:t xml:space="preserve">2025 CBC in effect January 1, 2026 — WUI / Part 7 mandatory</w:t>
       </w:r>
     </w:p>
     <w:p>
       <w:pPr>
-        <w:pStyle w:val="Heading1"/>
-        <w:spacing w:before="160" w:after="0" w:line="276" w:lineRule="auto"/>
+        <w:pStyle w:val="Heading"/>
       </w:pPr>
       <w:r>
         <w:rPr>
-          <w:rFonts w:ascii="Arial" w:hAnsi="Arial"/>
-          <w:b/>
-          <w:bCs/>
-          <w:sz w:val="20"/>
-          <w:szCs w:val="20"/>
           <w:u w:val="single"/>
           <w:rtl w:val="0"/>
           <w:lang w:val="en-US"/>
         </w:rPr>
-        <w:t xml:space="preserve">LOCAL PERMIT — PLACER COUNTY:</w:t>
+        <w:t>FDR PREPARATION:</w:t>
       </w:r>
     </w:p>
     <w:p>
       <w:pPr>
-        <w:pStyle w:val="Body"/>
+        <w:pStyle w:val="Body A"/>
         <w:numPr>
           <w:ilvl w:val="0"/>
           <w:numId w:val="2"/>
         </w:numPr>
-        <w:bidi w:val="0"/>
         <w:spacing w:after="0" w:line="276" w:lineRule="auto"/>
-        <w:ind w:right="0"/>
-        <w:jc w:val="left"/>
-        <w:rPr>
-          <w:rFonts w:ascii="Arial" w:hAnsi="Arial"/>
-          <w:sz w:val="20"/>
-          <w:szCs w:val="20"/>
-          <w:rtl w:val="0"/>
-          <w:lang w:val="en-US"/>
-        </w:rPr>
       </w:pPr>
       <w:r>
         <w:rPr>
@@ -504,27 +390,17 @@
           <w:rtl w:val="0"/>
           <w:lang w:val="en-US"/>
         </w:rPr>
-        <w:t xml:space="preserve">Target submittal July 12 — all-digital plan check via permits.placer.ca.gov</w:t>
+        <w:t xml:space="preserve">Target submittal July 29 — FDR board meeting August 11</w:t>
       </w:r>
     </w:p>
     <w:p>
       <w:pPr>
-        <w:pStyle w:val="Body"/>
+        <w:pStyle w:val="Body A"/>
         <w:numPr>
           <w:ilvl w:val="1"/>
           <w:numId w:val="2"/>
         </w:numPr>
-        <w:bidi w:val="0"/>
         <w:spacing w:after="0" w:line="276" w:lineRule="auto"/>
-        <w:ind w:right="0"/>
-        <w:jc w:val="left"/>
-        <w:rPr>
-          <w:rFonts w:ascii="Arial" w:hAnsi="Arial"/>
-          <w:sz w:val="20"/>
-          <w:szCs w:val="20"/>
-          <w:rtl w:val="0"/>
-          <w:lang w:val="en-US"/>
-        </w:rPr>
       </w:pPr>
       <w:r>
         <w:rPr>
@@ -534,86 +410,7 @@
           <w:rtl w:val="0"/>
           <w:lang w:val="en-US"/>
         </w:rPr>
-        <w:t xml:space="preserve">2025 CBC in effect Jan 1 2026 — WUI / Part 7 mandatory</w:t>
-      </w:r>
-    </w:p>
-    <w:p>
-      <w:pPr>
-        <w:pStyle w:val="Heading1"/>
-        <w:spacing w:before="160" w:after="0" w:line="276" w:lineRule="auto"/>
-      </w:pPr>
-      <w:r>
-        <w:rPr>
-          <w:rFonts w:ascii="Arial" w:hAnsi="Arial"/>
-          <w:b/>
-          <w:bCs/>
-          <w:sz w:val="20"/>
-          <w:szCs w:val="20"/>
-          <w:u w:val="single"/>
-          <w:rtl w:val="0"/>
-          <w:lang w:val="en-US"/>
-        </w:rPr>
-        <w:t xml:space="preserve">FDR PREPARATION:</w:t>
-      </w:r>
-    </w:p>
-    <w:p>
-      <w:pPr>
-        <w:pStyle w:val="Body"/>
-        <w:numPr>
-          <w:ilvl w:val="0"/>
-          <w:numId w:val="2"/>
-        </w:numPr>
-        <w:bidi w:val="0"/>
-        <w:spacing w:after="0" w:line="276" w:lineRule="auto"/>
-        <w:ind w:right="0"/>
-        <w:jc w:val="left"/>
-        <w:rPr>
-          <w:rFonts w:ascii="Arial" w:hAnsi="Arial"/>
-          <w:sz w:val="20"/>
-          <w:szCs w:val="20"/>
-          <w:rtl w:val="0"/>
-          <w:lang w:val="en-US"/>
-        </w:rPr>
-      </w:pPr>
-      <w:r>
-        <w:rPr>
-          <w:rFonts w:ascii="Arial" w:hAnsi="Arial"/>
-          <w:sz w:val="20"/>
-          <w:szCs w:val="20"/>
-          <w:rtl w:val="0"/>
-          <w:lang w:val="en-US"/>
-        </w:rPr>
-        <w:t xml:space="preserve">FDR submittal target July 29 — FDR board meeting August 11</w:t>
-      </w:r>
-    </w:p>
-    <w:p>
-      <w:pPr>
-        <w:pStyle w:val="Body"/>
-        <w:numPr>
-          <w:ilvl w:val="1"/>
-          <w:numId w:val="2"/>
-        </w:numPr>
-        <w:bidi w:val="0"/>
-        <w:spacing w:after="0" w:line="276" w:lineRule="auto"/>
-        <w:ind w:right="0"/>
-        <w:jc w:val="left"/>
-        <w:rPr>
-          <w:rFonts w:ascii="Arial" w:hAnsi="Arial"/>
-          <w:sz w:val="20"/>
-          <w:szCs w:val="20"/>
-          <w:rtl w:val="0"/>
-          <w:lang w:val="en-US"/>
-        </w:rPr>
-      </w:pPr>
-      <w:r>
-        <w:rPr>
-          <w:rFonts w:ascii="Arial" w:hAnsi="Arial"/>
-          <w:sz w:val="20"/>
-          <w:szCs w:val="20"/>
-          <w:rtl w:val="0"/>
-          <w:lang w:val="en-US"/>
-        </w:rPr>
-        <w:t xml:space="preserve">Begin drawings after PDR approval and consultant set receipt</w:t>
+        <w:t xml:space="preserve">Begin drawings after PDR approval and full consultant set received</w:t>
       </w:r>
     </w:p>
     <w:sectPr>
@@ -621,8 +418,6 @@
       <w:footerReference w:type="default" r:id="rId5"/>
       <w:pgSz w:w="12240" w:h="15840" w:orient="portrait"/>
       <w:pgMar w:top="1440" w:right="1440" w:bottom="1440" w:left="1440" w:header="720" w:footer="720"/>
-      <w:pgNumType w:start="1"/>
-      <w:bidi w:val="0"/>
     </w:sectPr>
   </w:body>
 </w:document>
@@ -632,7 +427,7 @@
 <w:ftr xmlns:r="http://schemas.openxmlformats.org/officeDocument/2006/relationships" xmlns:wp="http://schemas.openxmlformats.org/drawingml/2006/wordprocessingDrawing" xmlns:w="http://schemas.openxmlformats.org/wordprocessingml/2006/main" xmlns:w10="urn:schemas-microsoft-com:office:word" xmlns:w14="http://schemas.microsoft.com/office/word/2010/wordml" xmlns:wps="http://schemas.microsoft.com/office/word/2010/wordprocessingShape" xmlns:wpg="http://schemas.microsoft.com/office/word/2010/wordprocessingGroup" xmlns:mc="http://schemas.openxmlformats.org/markup-compatibility/2006" xmlns:v="urn:schemas-microsoft-com:vml" xmlns:o="urn:schemas-microsoft-com:office:office" xmlns:m="http://schemas.openxmlformats.org/officeDocument/2006/math" mc:Ignorable="w14">
   <w:p>
     <w:pPr>
-      <w:pStyle w:val="Body"/>
+      <w:pStyle w:val="Body A"/>
       <w:tabs>
         <w:tab w:val="center" w:pos="4680"/>
         <w:tab w:val="right" w:pos="9340"/>
@@ -674,7 +469,7 @@
   </w:p>
   <w:p>
     <w:pPr>
-      <w:pStyle w:val="Body"/>
+      <w:pStyle w:val="Body A"/>
       <w:tabs>
         <w:tab w:val="center" w:pos="4680"/>
         <w:tab w:val="right" w:pos="9340"/>
@@ -699,21 +494,6 @@
       </w:rPr>
       <w:t xml:space="preserve">w  w   w  . c l e v e r h o m e s . n e t   /   w  w  w . t o b y l o n g d e s i g n . c o m </w:t>
     </w:r>
-    <w:r>
-      <w:rPr>
-        <w:rFonts w:ascii="Arial" w:cs="Arial" w:hAnsi="Arial" w:eastAsia="Arial"/>
-        <w:outline w:val="0"/>
-        <w:color w:val="333300"/>
-        <w:sz w:val="20"/>
-        <w:szCs w:val="20"/>
-        <w:u w:color="333300"/>
-        <w14:textFill>
-          <w14:solidFill>
-            <w14:srgbClr w14:val="333300"/>
-          </w14:solidFill>
-        </w14:textFill>
-      </w:rPr>
-    </w:r>
   </w:p>
 </w:ftr>
 </file>
@@ -722,7 +502,7 @@
 <w:hdr xmlns:r="http://schemas.openxmlformats.org/officeDocument/2006/relationships" xmlns:wp="http://schemas.openxmlformats.org/drawingml/2006/wordprocessingDrawing" xmlns:w="http://schemas.openxmlformats.org/wordprocessingml/2006/main" xmlns:w10="urn:schemas-microsoft-com:office:word" xmlns:w14="http://schemas.microsoft.com/office/word/2010/wordml" xmlns:wps="http://schemas.microsoft.com/office/word/2010/wordprocessingShape" xmlns:wpg="http://schemas.microsoft.com/office/word/2010/wordprocessingGroup" xmlns:mc="http://schemas.openxmlformats.org/markup-compatibility/2006" xmlns:v="urn:schemas-microsoft-com:vml" xmlns:o="urn:schemas-microsoft-com:office:office" xmlns:m="http://schemas.openxmlformats.org/officeDocument/2006/math" mc:Ignorable="w14">
   <w:p>
     <w:pPr>
-      <w:pStyle w:val="Body"/>
+      <w:pStyle w:val="Body A"/>
       <w:tabs>
         <w:tab w:val="center" w:pos="4680"/>
         <w:tab w:val="right" w:pos="9340"/>
@@ -743,7 +523,7 @@
       </w:rPr>
       <w:drawing xmlns:a="http://schemas.openxmlformats.org/drawingml/2006/main">
         <wp:inline distT="0" distB="0" distL="0" distR="0">
-          <wp:extent cx="2025927" cy="995512"/>
+          <wp:extent cx="2025927" cy="995513"/>
           <wp:effectExtent l="0" t="0" r="0" b="0"/>
           <wp:docPr id="1073741825" name="officeArt object" descr="chxtld Logo.png"/>
           <wp:cNvGraphicFramePr/>
@@ -767,7 +547,7 @@
                 <pic:spPr>
                   <a:xfrm>
                     <a:off x="0" y="0"/>
-                    <a:ext cx="2025927" cy="995512"/>
+                    <a:ext cx="2025927" cy="995513"/>
                   </a:xfrm>
                   <a:prstGeom prst="rect">
                     <a:avLst/>
@@ -783,18 +563,6 @@
           </a:graphic>
         </wp:inline>
       </w:drawing>
-    </w:r>
-    <w:r>
-      <w:rPr>
-        <w:outline w:val="0"/>
-        <w:color w:val="000000"/>
-        <w:u w:color="000000"/>
-        <w14:textFill>
-          <w14:solidFill>
-            <w14:srgbClr w14:val="000000"/>
-          </w14:solidFill>
-        </w14:textFill>
-      </w:rPr>
     </w:r>
   </w:p>
 </w:hdr>
@@ -819,7 +587,11 @@
         <w:ind w:left="720" w:hanging="360"/>
       </w:pPr>
       <w:rPr>
-        <w:rFonts w:hAnsi="Arial Unicode MS"/>
+        <w:rFonts w:ascii="Arial" w:cs="Arial" w:hAnsi="Arial" w:eastAsia="Arial"/>
+        <w:b w:val="0"/>
+        <w:bCs w:val="0"/>
+        <w:i w:val="0"/>
+        <w:iCs w:val="0"/>
         <w:caps w:val="0"/>
         <w:smallCaps w:val="0"/>
         <w:strike w:val="0"/>
@@ -845,7 +617,11 @@
         <w:ind w:left="1440" w:hanging="360"/>
       </w:pPr>
       <w:rPr>
-        <w:rFonts w:hAnsi="Arial Unicode MS"/>
+        <w:rFonts w:ascii="Arial" w:cs="Arial" w:hAnsi="Arial" w:eastAsia="Arial"/>
+        <w:b w:val="0"/>
+        <w:bCs w:val="0"/>
+        <w:i w:val="0"/>
+        <w:iCs w:val="0"/>
         <w:caps w:val="0"/>
         <w:smallCaps w:val="0"/>
         <w:strike w:val="0"/>
@@ -868,10 +644,14 @@
       <w:lvlText w:val="■"/>
       <w:lvlJc w:val="left"/>
       <w:pPr>
-        <w:ind w:left="2160" w:hanging="360"/>
+        <w:ind w:left="2232" w:hanging="432"/>
       </w:pPr>
       <w:rPr>
-        <w:rFonts w:hAnsi="Arial Unicode MS"/>
+        <w:rFonts w:ascii="Arial" w:cs="Arial" w:hAnsi="Arial" w:eastAsia="Arial"/>
+        <w:b w:val="0"/>
+        <w:bCs w:val="0"/>
+        <w:i w:val="0"/>
+        <w:iCs w:val="0"/>
         <w:caps w:val="0"/>
         <w:smallCaps w:val="0"/>
         <w:strike w:val="0"/>
@@ -894,10 +674,14 @@
       <w:lvlText w:val="●"/>
       <w:lvlJc w:val="left"/>
       <w:pPr>
-        <w:ind w:left="2880" w:hanging="360"/>
+        <w:ind w:left="2952" w:hanging="432"/>
       </w:pPr>
       <w:rPr>
-        <w:rFonts w:hAnsi="Arial Unicode MS"/>
+        <w:rFonts w:ascii="Arial" w:cs="Arial" w:hAnsi="Arial" w:eastAsia="Arial"/>
+        <w:b w:val="0"/>
+        <w:bCs w:val="0"/>
+        <w:i w:val="0"/>
+        <w:iCs w:val="0"/>
         <w:caps w:val="0"/>
         <w:smallCaps w:val="0"/>
         <w:strike w:val="0"/>
@@ -920,10 +704,14 @@
       <w:lvlText w:val="○"/>
       <w:lvlJc w:val="left"/>
       <w:pPr>
-        <w:ind w:left="3600" w:hanging="360"/>
+        <w:ind w:left="3672" w:hanging="432"/>
       </w:pPr>
       <w:rPr>
-        <w:rFonts w:hAnsi="Arial Unicode MS"/>
+        <w:rFonts w:ascii="Arial" w:cs="Arial" w:hAnsi="Arial" w:eastAsia="Arial"/>
+        <w:b w:val="0"/>
+        <w:bCs w:val="0"/>
+        <w:i w:val="0"/>
+        <w:iCs w:val="0"/>
         <w:caps w:val="0"/>
         <w:smallCaps w:val="0"/>
         <w:strike w:val="0"/>
@@ -946,10 +734,14 @@
       <w:lvlText w:val="■"/>
       <w:lvlJc w:val="left"/>
       <w:pPr>
-        <w:ind w:left="4320" w:hanging="360"/>
+        <w:ind w:left="4392" w:hanging="432"/>
       </w:pPr>
       <w:rPr>
-        <w:rFonts w:hAnsi="Arial Unicode MS"/>
+        <w:rFonts w:ascii="Arial" w:cs="Arial" w:hAnsi="Arial" w:eastAsia="Arial"/>
+        <w:b w:val="0"/>
+        <w:bCs w:val="0"/>
+        <w:i w:val="0"/>
+        <w:iCs w:val="0"/>
         <w:caps w:val="0"/>
         <w:smallCaps w:val="0"/>
         <w:strike w:val="0"/>
@@ -972,10 +764,14 @@
       <w:lvlText w:val="●"/>
       <w:lvlJc w:val="left"/>
       <w:pPr>
-        <w:ind w:left="5040" w:hanging="360"/>
+        <w:ind w:left="5112" w:hanging="432"/>
       </w:pPr>
       <w:rPr>
-        <w:rFonts w:hAnsi="Arial Unicode MS"/>
+        <w:rFonts w:ascii="Arial" w:cs="Arial" w:hAnsi="Arial" w:eastAsia="Arial"/>
+        <w:b w:val="0"/>
+        <w:bCs w:val="0"/>
+        <w:i w:val="0"/>
+        <w:iCs w:val="0"/>
         <w:caps w:val="0"/>
         <w:smallCaps w:val="0"/>
         <w:strike w:val="0"/>
@@ -998,10 +794,14 @@
       <w:lvlText w:val="○"/>
       <w:lvlJc w:val="left"/>
       <w:pPr>
-        <w:ind w:left="5760" w:hanging="360"/>
+        <w:ind w:left="5832" w:hanging="432"/>
       </w:pPr>
       <w:rPr>
-        <w:rFonts w:hAnsi="Arial Unicode MS"/>
+        <w:rFonts w:ascii="Arial" w:cs="Arial" w:hAnsi="Arial" w:eastAsia="Arial"/>
+        <w:b w:val="0"/>
+        <w:bCs w:val="0"/>
+        <w:i w:val="0"/>
+        <w:iCs w:val="0"/>
         <w:caps w:val="0"/>
         <w:smallCaps w:val="0"/>
         <w:strike w:val="0"/>
@@ -1024,10 +824,14 @@
       <w:lvlText w:val="■"/>
       <w:lvlJc w:val="left"/>
       <w:pPr>
-        <w:ind w:left="6480" w:hanging="360"/>
+        <w:ind w:left="6552" w:hanging="432"/>
       </w:pPr>
       <w:rPr>
-        <w:rFonts w:hAnsi="Arial Unicode MS"/>
+        <w:rFonts w:ascii="Arial" w:cs="Arial" w:hAnsi="Arial" w:eastAsia="Arial"/>
+        <w:b w:val="0"/>
+        <w:bCs w:val="0"/>
+        <w:i w:val="0"/>
+        <w:iCs w:val="0"/>
         <w:caps w:val="0"/>
         <w:smallCaps w:val="0"/>
         <w:strike w:val="0"/>
@@ -1160,9 +964,9 @@
     <w:next w:val="No List"/>
     <w:pPr/>
   </w:style>
-  <w:style w:type="paragraph" w:styleId="Body">
-    <w:name w:val="Body"/>
-    <w:next w:val="Body"/>
+  <w:style w:type="paragraph" w:styleId="Body A">
+    <w:name w:val="Body A"/>
+    <w:next w:val="Body A"/>
     <w:pPr>
       <w:keepNext w:val="0"/>
       <w:keepLines w:val="0"/>
@@ -1196,8 +1000,9 @@
       <w:u w:val="none" w:color="000000"/>
       <w:shd w:val="nil" w:color="auto" w:fill="auto"/>
       <w:vertAlign w:val="baseline"/>
-      <w14:textOutline>
+      <w14:textOutline w14:w="12700" w14:cap="flat">
         <w14:noFill/>
+        <w14:miter w14:lim="400000"/>
       </w14:textOutline>
       <w14:textFill>
         <w14:solidFill>
@@ -1208,7 +1013,7 @@
   </w:style>
   <w:style w:type="paragraph" w:styleId="Title">
     <w:name w:val="Title"/>
-    <w:next w:val="Body"/>
+    <w:next w:val="Body A"/>
     <w:pPr>
       <w:keepNext w:val="1"/>
       <w:keepLines w:val="1"/>
@@ -1223,7 +1028,7 @@
       <w:outlineLvl w:val="9"/>
     </w:pPr>
     <w:rPr>
-      <w:rFonts w:ascii="Calibri" w:cs="Calibri" w:hAnsi="Calibri" w:eastAsia="Calibri"/>
+      <w:rFonts w:ascii="Calibri" w:cs="Arial Unicode MS" w:hAnsi="Calibri" w:eastAsia="Arial Unicode MS"/>
       <w:b w:val="1"/>
       <w:bCs w:val="1"/>
       <w:i w:val="0"/>
@@ -1240,6 +1045,54 @@
       <w:sz w:val="72"/>
       <w:szCs w:val="72"/>
       <w:u w:val="none" w:color="000000"/>
+      <w:shd w:val="nil" w:color="auto" w:fill="auto"/>
+      <w:vertAlign w:val="baseline"/>
+      <w:lang w:val="en-US"/>
+      <w14:textOutline w14:w="12700" w14:cap="flat">
+        <w14:noFill/>
+        <w14:miter w14:lim="400000"/>
+      </w14:textOutline>
+      <w14:textFill>
+        <w14:solidFill>
+          <w14:srgbClr w14:val="000000"/>
+        </w14:solidFill>
+      </w14:textFill>
+    </w:rPr>
+  </w:style>
+  <w:style w:type="paragraph" w:styleId="Heading">
+    <w:name w:val="Heading"/>
+    <w:next w:val="Body A"/>
+    <w:pPr>
+      <w:keepNext w:val="1"/>
+      <w:keepLines w:val="0"/>
+      <w:pageBreakBefore w:val="0"/>
+      <w:widowControl w:val="1"/>
+      <w:shd w:val="clear" w:color="auto" w:fill="auto"/>
+      <w:suppressAutoHyphens w:val="0"/>
+      <w:bidi w:val="0"/>
+      <w:spacing w:before="160" w:after="0" w:line="276" w:lineRule="auto"/>
+      <w:ind w:left="0" w:right="0" w:firstLine="0"/>
+      <w:jc w:val="left"/>
+      <w:outlineLvl w:val="0"/>
+    </w:pPr>
+    <w:rPr>
+      <w:rFonts w:ascii="Arial" w:cs="Arial Unicode MS" w:hAnsi="Arial" w:eastAsia="Arial Unicode MS"/>
+      <w:b w:val="1"/>
+      <w:bCs w:val="1"/>
+      <w:i w:val="0"/>
+      <w:iCs w:val="0"/>
+      <w:caps w:val="0"/>
+      <w:smallCaps w:val="0"/>
+      <w:strike w:val="0"/>
+      <w:dstrike w:val="0"/>
+      <w:outline w:val="0"/>
+      <w:color w:val="000000"/>
+      <w:spacing w:val="0"/>
+      <w:kern w:val="0"/>
+      <w:position w:val="0"/>
+      <w:sz w:val="20"/>
+      <w:szCs w:val="20"/>
+      <w:u w:val="single" w:color="000000"/>
       <w:shd w:val="nil" w:color="auto" w:fill="auto"/>
       <w:vertAlign w:val="baseline"/>
       <w:lang w:val="en-US"/>
@@ -1260,24 +1113,6 @@
         <w:numId w:val="1"/>
       </w:numPr>
     </w:pPr>
-  </w:style>
-  <w:style w:type="paragraph" w:styleId="Heading1">
-    <w:name w:val="heading 1"/>
-    <w:basedOn w:val="Body"/>
-    <w:next w:val="Body"/>
-    <w:pPr>
-      <w:keepNext w:val="1"/>
-      <w:spacing w:before="160" w:after="0" w:line="276" w:lineRule="auto"/>
-      <w:outlineLvl w:val="0"/>
-    </w:pPr>
-    <w:rPr>
-      <w:rFonts w:ascii="Arial" w:cs="Arial" w:hAnsi="Arial" w:eastAsia="Arial"/>
-      <w:b/>
-      <w:bCs/>
-      <w:sz w:val="20"/>
-      <w:szCs w:val="20"/>
-      <w:u w:val="single"/>
-    </w:rPr>
   </w:style>
 </w:styles>
 </file>
@@ -1427,9 +1262,9 @@
         </a:effectStyle>
         <a:effectStyle>
           <a:effectLst>
-            <a:outerShdw sx="100000" sy="100000" kx="0" ky="0" algn="b" rotWithShape="0" blurRad="38100" dist="20000" dir="5400000">
+            <a:outerShdw sx="100000" sy="100000" kx="0" ky="0" algn="b" rotWithShape="0" blurRad="38100" dist="23000" dir="5400000">
               <a:srgbClr val="000000">
-                <a:alpha val="38000"/>
+                <a:alpha val="35000"/>
               </a:srgbClr>
             </a:outerShdw>
           </a:effectLst>
@@ -1509,7 +1344,7 @@
         </a:effectLst>
         <a:sp3d/>
       </a:spPr>
-      <a:bodyPr rot="0" spcFirstLastPara="1" vertOverflow="overflow" horzOverflow="overflow" vert="horz" wrap="square" lIns="45719" tIns="45719" rIns="45719" bIns="45719" numCol="1" spcCol="38100" rtlCol="0" anchor="ctr" upright="0">
+      <a:bodyPr rot="0" spcFirstLastPara="1" vertOverflow="overflow" horzOverflow="overflow" vert="horz" wrap="square" lIns="45718" tIns="45718" rIns="45718" bIns="45718" numCol="1" spcCol="38100" rtlCol="0" anchor="ctr" upright="0">
         <a:spAutoFit/>
       </a:bodyPr>
       <a:lstStyle>
@@ -1537,10 +1372,10 @@
             </a:solidFill>
             <a:effectLst/>
             <a:uFillTx/>
-            <a:latin typeface="Cambria"/>
-            <a:ea typeface="Cambria"/>
-            <a:cs typeface="Cambria"/>
-            <a:sym typeface="Cambria"/>
+            <a:latin typeface="+mn-lt"/>
+            <a:ea typeface="+mn-ea"/>
+            <a:cs typeface="+mn-cs"/>
+            <a:sym typeface="Helvetica Neue"/>
           </a:defRPr>
         </a:defPPr>
         <a:lvl1pPr marL="0" marR="0" indent="0" algn="l" defTabSz="914400" rtl="0" fontAlgn="auto" latinLnBrk="1" hangingPunct="0">
@@ -1796,9 +1631,9 @@
           <a:round/>
         </a:ln>
         <a:effectLst>
-          <a:outerShdw sx="100000" sy="100000" kx="0" ky="0" algn="b" rotWithShape="0" blurRad="38100" dist="20000" dir="5400000">
+          <a:outerShdw sx="100000" sy="100000" kx="0" ky="0" algn="b" rotWithShape="0" blurRad="38100" dist="23000" dir="5400000">
             <a:srgbClr val="000000">
-              <a:alpha val="38000"/>
+              <a:alpha val="35000"/>
             </a:srgbClr>
           </a:outerShdw>
         </a:effectLst>
@@ -2086,7 +1921,7 @@
         <a:effectLst/>
         <a:sp3d/>
       </a:spPr>
-      <a:bodyPr rot="0" spcFirstLastPara="1" vertOverflow="overflow" horzOverflow="overflow" vert="horz" wrap="square" lIns="45719" tIns="45719" rIns="45719" bIns="45719" numCol="1" spcCol="38100" rtlCol="0" anchor="t" upright="0">
+      <a:bodyPr rot="0" spcFirstLastPara="1" vertOverflow="overflow" horzOverflow="overflow" vert="horz" wrap="square" lIns="45718" tIns="45718" rIns="45718" bIns="45718" numCol="1" spcCol="38100" rtlCol="0" anchor="t" upright="0">
         <a:spAutoFit/>
       </a:bodyPr>
       <a:lstStyle>
@@ -2114,10 +1949,10 @@
             </a:solidFill>
             <a:effectLst/>
             <a:uFillTx/>
-            <a:latin typeface="Cambria"/>
-            <a:ea typeface="Cambria"/>
-            <a:cs typeface="Cambria"/>
-            <a:sym typeface="Cambria"/>
+            <a:latin typeface="+mn-lt"/>
+            <a:ea typeface="+mn-ea"/>
+            <a:cs typeface="+mn-cs"/>
+            <a:sym typeface="Helvetica Neue"/>
           </a:defRPr>
         </a:defPPr>
         <a:lvl1pPr marL="0" marR="0" indent="0" algn="l" defTabSz="914400" rtl="0" fontAlgn="auto" latinLnBrk="1" hangingPunct="0">

</xml_diff>

<commit_message>
update: clean 6-section agenda docx
</commit_message>
<xml_diff>
--- a/files/260609_KELLY_Weekly_Agenda.docx
+++ b/files/260609_KELLY_Weekly_Agenda.docx
@@ -5,8 +5,6 @@
     <w:p>
       <w:pPr>
         <w:pStyle w:val="Title"/>
-        <w:keepNext w:val="0"/>
-        <w:keepLines w:val="0"/>
         <w:spacing w:before="100" w:after="0" w:line="240" w:lineRule="auto"/>
       </w:pPr>
       <w:r>
@@ -18,14 +16,12 @@
           <w:rtl w:val="0"/>
           <w:lang w:val="en-US"/>
         </w:rPr>
-        <w:t>KELLY RESIDENCE</w:t>
+        <w:t xml:space="preserve">KELLY RESIDENCE</w:t>
       </w:r>
     </w:p>
     <w:p>
       <w:pPr>
         <w:pStyle w:val="Title"/>
-        <w:keepNext w:val="0"/>
-        <w:keepLines w:val="0"/>
         <w:spacing w:before="100" w:after="0" w:line="240" w:lineRule="auto"/>
       </w:pPr>
       <w:r>
@@ -36,7 +32,7 @@
           <w:rtl w:val="0"/>
           <w:lang w:val="en-US"/>
         </w:rPr>
-        <w:t>Weekly Agenda</w:t>
+        <w:t xml:space="preserve">Weekly Agenda</w:t>
       </w:r>
     </w:p>
     <w:p>
@@ -416,7 +412,7 @@
     <w:sectPr>
       <w:headerReference w:type="default" r:id="rId4"/>
       <w:footerReference w:type="default" r:id="rId5"/>
-      <w:pgSz w:w="12240" w:h="15840" w:orient="portrait"/>
+      <w:pgSz w:w="12240" w:h="15840"/>
       <w:pgMar w:top="1440" w:right="1440" w:bottom="1440" w:left="1440" w:header="720" w:footer="720"/>
     </w:sectPr>
   </w:body>

</xml_diff>

<commit_message>
update: agenda 5 items, no Mod 1
</commit_message>
<xml_diff>
--- a/files/260609_KELLY_Weekly_Agenda.docx
+++ b/files/260609_KELLY_Weekly_Agenda.docx
@@ -193,61 +193,6 @@
           <w:lang w:val="en-US"/>
         </w:rPr>
         <w:t xml:space="preserve">50% set issued — all consultants in coordination for state and local permit</w:t>
-      </w:r>
-    </w:p>
-    <w:p>
-      <w:pPr>
-        <w:pStyle w:val="Heading"/>
-      </w:pPr>
-      <w:r>
-        <w:rPr>
-          <w:u w:val="single"/>
-          <w:rtl w:val="0"/>
-          <w:lang w:val="en-US"/>
-        </w:rPr>
-        <w:t>MOD 1 INTERIORS:</w:t>
-      </w:r>
-    </w:p>
-    <w:p>
-      <w:pPr>
-        <w:pStyle w:val="Body A"/>
-        <w:numPr>
-          <w:ilvl w:val="0"/>
-          <w:numId w:val="2"/>
-        </w:numPr>
-        <w:spacing w:after="0" w:line="276" w:lineRule="auto"/>
-      </w:pPr>
-      <w:r>
-        <w:rPr>
-          <w:rFonts w:ascii="Arial" w:hAnsi="Arial"/>
-          <w:b/>
-          <w:bCs/>
-          <w:sz w:val="20"/>
-          <w:szCs w:val="20"/>
-          <w:rtl w:val="0"/>
-          <w:lang w:val="en-US"/>
-        </w:rPr>
-        <w:t xml:space="preserve">Coordinate Mod 1 interior layout to meet state permit deadline</w:t>
-      </w:r>
-    </w:p>
-    <w:p>
-      <w:pPr>
-        <w:pStyle w:val="Body A"/>
-        <w:numPr>
-          <w:ilvl w:val="1"/>
-          <w:numId w:val="2"/>
-        </w:numPr>
-        <w:spacing w:after="0" w:line="276" w:lineRule="auto"/>
-      </w:pPr>
-      <w:r>
-        <w:rPr>
-          <w:rFonts w:ascii="Arial" w:hAnsi="Arial"/>
-          <w:sz w:val="20"/>
-          <w:szCs w:val="20"/>
-          <w:rtl w:val="0"/>
-          <w:lang w:val="en-US"/>
-        </w:rPr>
-        <w:t xml:space="preserve">Mechanical room, master bath, laundry scope to be finalized</w:t>
       </w:r>
     </w:p>
     <w:p>

</xml_diff>